<commit_message>
Enhance CI display on WII hero card and update documentation suite
</commit_message>
<xml_diff>
--- a/docs/AI Use Impact Tracker v2 - Methodology.docx
+++ b/docs/AI Use Impact Tracker v2 - Methodology.docx
@@ -71,7 +71,7 @@
           <w:sz w:val="22"/>
           <w:szCs w:val="22"/>
         </w:rPr>
-        <w:t xml:space="preserve">April 2026  |  </w:t>
+        <w:t xml:space="preserve">May 2026  |  </w:t>
       </w:r>
       <w:r>
         <w:rPr>
@@ -1542,7 +1542,7 @@
           <w:sz w:val="22"/>
           <w:szCs w:val="22"/>
         </w:rPr>
-        <w:t xml:space="preserve">For each respondent in the impact denominator, the per-respondent score is the sum of weights for all impact flags they selected:</w:t>
+        <w:t xml:space="preserve">For each respondent in the impact denominator, the per-respondent score is the dot product of their binary flag vector against the weight vector:</w:t>
       </w:r>
     </w:p>
     <w:p>
@@ -1552,14 +1552,31 @@
       </w:pPr>
       <w:r>
         <w:rPr>
-          <w:rFonts w:ascii="Courier New" w:cs="Courier New" w:eastAsia="Courier New" w:hAnsi="Courier New"/>
+          <w:rFonts w:ascii="Cambria Math" w:cs="Cambria Math" w:eastAsia="Cambria Math" w:hAnsi="Cambria Math"/>
           <w:b/>
           <w:bCs/>
           <w:color w:val="6366F1"/>
-          <w:sz w:val="24"/>
-          <w:szCs w:val="24"/>
-        </w:rPr>
-        <w:t xml:space="preserve">score(i) = Σ  w(f) × flag(i, f)</w:t>
+          <w:sz w:val="26"/>
+          <w:szCs w:val="26"/>
+        </w:rPr>
+        <w:t xml:space="preserve">sᵢ = ∑ wₑ ⋅ 𝟙[ flagₑ,ᵢ ]</w:t>
+      </w:r>
+    </w:p>
+    <w:p>
+      <w:pPr>
+        <w:spacing w:after="200"/>
+        <w:jc w:val="center"/>
+      </w:pPr>
+      <w:r>
+        <w:rPr>
+          <w:rFonts w:ascii="Cambria Math" w:cs="Cambria Math" w:eastAsia="Cambria Math" w:hAnsi="Cambria Math"/>
+          <w:i/>
+          <w:iCs/>
+          <w:color w:val="666666"/>
+          <w:sz w:val="22"/>
+          <w:szCs w:val="22"/>
+        </w:rPr>
+        <w:t xml:space="preserve">f ∈ ℱ</w:t>
       </w:r>
     </w:p>
     <w:p>
@@ -1572,7 +1589,7 @@
           <w:sz w:val="22"/>
           <w:szCs w:val="22"/>
         </w:rPr>
-        <w:t xml:space="preserve">where w(f) is the weight for flag f, and flag(i, f) is 1 if respondent i selected that flag, 0 otherwise.</w:t>
+        <w:t xml:space="preserve">where wₑ is the weight for flag f from the IMPACT_WEIGHTS table, 𝟙[flagₑ,ᵢ] is the indicator function (1 if respondent i selected flag f, 0 otherwise), and ℱ is the set of eight weighted impact flags.</w:t>
       </w:r>
     </w:p>
     <w:p>
@@ -2269,19 +2286,132 @@
     </w:p>
     <w:p>
       <w:pPr>
-        <w:spacing w:after="200" w:before="200"/>
+        <w:spacing w:after="100" w:before="200"/>
         <w:jc w:val="center"/>
       </w:pPr>
       <w:r>
         <w:rPr>
-          <w:rFonts w:ascii="Courier New" w:cs="Courier New" w:eastAsia="Courier New" w:hAnsi="Courier New"/>
+          <w:rFonts w:ascii="Cambria Math" w:cs="Cambria Math" w:eastAsia="Cambria Math" w:hAnsi="Cambria Math"/>
+          <w:b/>
+          <w:bCs/>
+          <w:color w:val="6366F1"/>
+          <w:sz w:val="26"/>
+          <w:szCs w:val="26"/>
+        </w:rPr>
+        <w:t xml:space="preserve">WII  =  (1 / Nᵈ) ⋅ ∑ sᵢ</w:t>
+      </w:r>
+    </w:p>
+    <w:p>
+      <w:pPr>
+        <w:spacing w:after="200"/>
+        <w:jc w:val="center"/>
+      </w:pPr>
+      <w:r>
+        <w:rPr>
+          <w:rFonts w:ascii="Cambria Math" w:cs="Cambria Math" w:eastAsia="Cambria Math" w:hAnsi="Cambria Math"/>
+          <w:i/>
+          <w:iCs/>
+          <w:color w:val="666666"/>
+          <w:sz w:val="22"/>
+          <w:szCs w:val="22"/>
+        </w:rPr>
+        <w:t xml:space="preserve">i ∈ 𝒟</w:t>
+      </w:r>
+    </w:p>
+    <w:p>
+      <w:pPr>
+        <w:spacing w:after="160"/>
+      </w:pPr>
+      <w:r>
+        <w:rPr>
+          <w:rFonts w:ascii="Arial" w:cs="Arial" w:eastAsia="Arial" w:hAnsi="Arial"/>
+          <w:b/>
+          <w:bCs/>
+          <w:color w:val="2E5C8A"/>
+          <w:sz w:val="22"/>
+          <w:szCs w:val="22"/>
+        </w:rPr>
+        <w:t xml:space="preserve">Example:</w:t>
+      </w:r>
+      <w:r>
+        <w:rPr>
+          <w:rFonts w:ascii="Arial" w:cs="Arial" w:eastAsia="Arial" w:hAnsi="Arial"/>
+          <w:sz w:val="22"/>
+          <w:szCs w:val="22"/>
+        </w:rPr>
+        <w:t xml:space="preserve"> Using the five respondents above:</w:t>
+      </w:r>
+    </w:p>
+    <w:p>
+      <w:pPr>
+        <w:spacing w:after="120" w:before="120"/>
+        <w:jc w:val="center"/>
+      </w:pPr>
+      <w:r>
+        <w:rPr>
+          <w:rFonts w:ascii="Cambria Math" w:cs="Cambria Math" w:eastAsia="Cambria Math" w:hAnsi="Cambria Math"/>
           <w:b/>
           <w:bCs/>
           <w:color w:val="6366F1"/>
           <w:sz w:val="24"/>
           <w:szCs w:val="24"/>
         </w:rPr>
-        <w:t xml:space="preserve">WII = (1/N) × Σ score(i)</w:t>
+        <w:t xml:space="preserve">WII = (0.00 + 1.00 + (−1.00) + 1.50 + (−1.00)) / 5 = +0.10</w:t>
+      </w:r>
+    </w:p>
+    <w:p>
+      <w:pPr>
+        <w:spacing w:after="160"/>
+      </w:pPr>
+      <w:r>
+        <w:rPr>
+          <w:rFonts w:ascii="Arial" w:cs="Arial" w:eastAsia="Arial" w:hAnsi="Arial"/>
+          <w:sz w:val="22"/>
+          <w:szCs w:val="22"/>
+        </w:rPr>
+        <w:t xml:space="preserve">In practice, with tens of thousands of respondents per month, global WII values land around +0.14 to +0.18 — net positive, meaning the weighted benefit of AI on work slightly outweighs the weighted harm.</w:t>
+      </w:r>
+    </w:p>
+    <w:p>
+      <w:pPr>
+        <w:pStyle w:val="Heading2"/>
+      </w:pPr>
+      <w:r>
+        <w:t xml:space="preserve">4.3 Impact Denominator</w:t>
+      </w:r>
+    </w:p>
+    <w:p>
+      <w:pPr>
+        <w:spacing w:after="160"/>
+      </w:pPr>
+      <w:r>
+        <w:rPr>
+          <w:rFonts w:ascii="Arial" w:cs="Arial" w:eastAsia="Arial" w:hAnsi="Arial"/>
+          <w:sz w:val="22"/>
+          <w:szCs w:val="22"/>
+        </w:rPr>
+        <w:t xml:space="preserve">The denominator includes only respondents who: (a) use AI at any frequency (ai_freq &gt;= 1), and (b) have at least one non-null impact response. Respondents who selected only N/A or left the field blank are excluded.</w:t>
+      </w:r>
+    </w:p>
+    <w:p>
+      <w:pPr>
+        <w:pStyle w:val="Heading2"/>
+      </w:pPr>
+      <w:r>
+        <w:t xml:space="preserve">4.4 Confidence Intervals</w:t>
+      </w:r>
+    </w:p>
+    <w:p>
+      <w:pPr>
+        <w:spacing w:after="160"/>
+      </w:pPr>
+      <w:r>
+        <w:rPr>
+          <w:rFonts w:ascii="Arial" w:cs="Arial" w:eastAsia="Arial" w:hAnsi="Arial"/>
+          <w:sz w:val="22"/>
+          <w:szCs w:val="22"/>
+        </w:rPr>
+        <w:t xml:space="preserve">Two different confidence interval methods are used depending on the metric type:</w:t>
       </w:r>
     </w:p>
     <w:p>
@@ -2297,6 +2427,77 @@
           <w:sz w:val="22"/>
           <w:szCs w:val="22"/>
         </w:rPr>
+        <w:t xml:space="preserve">Wald confidence interval (WII).</w:t>
+      </w:r>
+      <w:r>
+        <w:rPr>
+          <w:rFonts w:ascii="Arial" w:cs="Arial" w:eastAsia="Arial" w:hAnsi="Arial"/>
+          <w:sz w:val="22"/>
+          <w:szCs w:val="22"/>
+        </w:rPr>
+        <w:t xml:space="preserve"> The Weighted Impact Index is a mean of continuous per-respondent scores (ranging roughly from −1 to +1.5). Its 95% CI is computed via the standard error of the mean (SEM):</w:t>
+      </w:r>
+    </w:p>
+    <w:p>
+      <w:pPr>
+        <w:spacing w:after="100" w:before="200"/>
+        <w:jc w:val="center"/>
+      </w:pPr>
+      <w:r>
+        <w:rPr>
+          <w:rFonts w:ascii="Cambria Math" w:cs="Cambria Math" w:eastAsia="Cambria Math" w:hAnsi="Cambria Math"/>
+          <w:b/>
+          <w:bCs/>
+          <w:color w:val="1F3A5F"/>
+          <w:sz w:val="26"/>
+          <w:szCs w:val="26"/>
+        </w:rPr>
+        <w:t xml:space="preserve">CI  =  WII  ±  1.96 × σₛ / √Nᵈ</w:t>
+      </w:r>
+    </w:p>
+    <w:p>
+      <w:pPr>
+        <w:spacing w:after="200"/>
+        <w:jc w:val="center"/>
+      </w:pPr>
+      <w:r>
+        <w:rPr>
+          <w:rFonts w:ascii="Cambria Math" w:cs="Cambria Math" w:eastAsia="Cambria Math" w:hAnsi="Cambria Math"/>
+          <w:i/>
+          <w:iCs/>
+          <w:color w:val="666666"/>
+          <w:sz w:val="20"/>
+          <w:szCs w:val="20"/>
+        </w:rPr>
+        <w:t xml:space="preserve">σₛ = std dev of per-respondent scores</w:t>
+      </w:r>
+    </w:p>
+    <w:p>
+      <w:pPr>
+        <w:spacing w:after="160"/>
+      </w:pPr>
+      <w:r>
+        <w:rPr>
+          <w:rFonts w:ascii="Arial" w:cs="Arial" w:eastAsia="Arial" w:hAnsi="Arial"/>
+          <w:sz w:val="22"/>
+          <w:szCs w:val="22"/>
+        </w:rPr>
+        <w:t xml:space="preserve">where SD is the standard deviation of the per-respondent scores and N is the impact denominator size. The constant 1.96 is the z-score from the standard normal distribution corresponding to 95% confidence (2.5% in each tail). This is justified by the Central Limit Theorem: with tens of thousands of respondents per month, the sampling distribution of the mean is approximately normal regardless of the underlying score distribution.</w:t>
+      </w:r>
+    </w:p>
+    <w:p>
+      <w:pPr>
+        <w:spacing w:after="160"/>
+      </w:pPr>
+      <w:r>
+        <w:rPr>
+          <w:rFonts w:ascii="Arial" w:cs="Arial" w:eastAsia="Arial" w:hAnsi="Arial"/>
+          <w:b/>
+          <w:bCs/>
+          <w:color w:val="2E5C8A"/>
+          <w:sz w:val="22"/>
+          <w:szCs w:val="22"/>
+        </w:rPr>
         <w:t xml:space="preserve">Example:</w:t>
       </w:r>
       <w:r>
@@ -2305,7 +2506,7 @@
           <w:sz w:val="22"/>
           <w:szCs w:val="22"/>
         </w:rPr>
-        <w:t xml:space="preserve"> Using the five respondents above:</w:t>
+        <w:t xml:space="preserve"> For March 2026 with WII = +0.147 and ~25,000 respondents:</w:t>
       </w:r>
     </w:p>
     <w:p>
@@ -2315,14 +2516,14 @@
       </w:pPr>
       <w:r>
         <w:rPr>
-          <w:rFonts w:ascii="Courier New" w:cs="Courier New" w:eastAsia="Courier New" w:hAnsi="Courier New"/>
+          <w:rFonts w:ascii="Cambria Math" w:cs="Cambria Math" w:eastAsia="Cambria Math" w:hAnsi="Cambria Math"/>
           <w:b/>
           <w:bCs/>
           <w:color w:val="6366F1"/>
-          <w:sz w:val="22"/>
-          <w:szCs w:val="22"/>
-        </w:rPr>
-        <w:t xml:space="preserve">WII = (0.00 + 1.00 + (−1.00) + 1.50 + (−1.00)) / 5 = +0.50 / 5 = +0.10</w:t>
+          <w:sz w:val="24"/>
+          <w:szCs w:val="24"/>
+        </w:rPr>
+        <w:t xml:space="preserve">CI = 0.147 ± 1.96 × σₛ / √25,000 = [0.140, 0.153]</w:t>
       </w:r>
     </w:p>
     <w:p>
@@ -2335,49 +2536,7 @@
           <w:sz w:val="22"/>
           <w:szCs w:val="22"/>
         </w:rPr>
-        <w:t xml:space="preserve">In practice, with tens of thousands of respondents per month, global WII values land around +0.14 to +0.18 — net positive, meaning the weighted benefit of AI on work slightly outweighs the weighted harm.</w:t>
-      </w:r>
-    </w:p>
-    <w:p>
-      <w:pPr>
-        <w:pStyle w:val="Heading2"/>
-      </w:pPr>
-      <w:r>
-        <w:t xml:space="preserve">4.3 Impact Denominator</w:t>
-      </w:r>
-    </w:p>
-    <w:p>
-      <w:pPr>
-        <w:spacing w:after="160"/>
-      </w:pPr>
-      <w:r>
-        <w:rPr>
-          <w:rFonts w:ascii="Arial" w:cs="Arial" w:eastAsia="Arial" w:hAnsi="Arial"/>
-          <w:sz w:val="22"/>
-          <w:szCs w:val="22"/>
-        </w:rPr>
-        <w:t xml:space="preserve">The denominator includes only respondents who: (a) use AI at any frequency (ai_freq &gt;= 1), and (b) have at least one non-null impact response. Respondents who selected only N/A or left the field blank are excluded.</w:t>
-      </w:r>
-    </w:p>
-    <w:p>
-      <w:pPr>
-        <w:pStyle w:val="Heading2"/>
-      </w:pPr>
-      <w:r>
-        <w:t xml:space="preserve">4.4 Confidence Intervals</w:t>
-      </w:r>
-    </w:p>
-    <w:p>
-      <w:pPr>
-        <w:spacing w:after="160"/>
-      </w:pPr>
-      <w:r>
-        <w:rPr>
-          <w:rFonts w:ascii="Arial" w:cs="Arial" w:eastAsia="Arial" w:hAnsi="Arial"/>
-          <w:sz w:val="22"/>
-          <w:szCs w:val="22"/>
-        </w:rPr>
-        <w:t xml:space="preserve">Two different confidence interval methods are used depending on the metric type:</w:t>
+        <w:t xml:space="preserve">The interval is tight (±0.007) because N is large. The entire interval is above zero, meaning the positive weighted impact is statistically significant.</w:t>
       </w:r>
     </w:p>
     <w:p>
@@ -2393,45 +2552,15 @@
           <w:sz w:val="22"/>
           <w:szCs w:val="22"/>
         </w:rPr>
-        <w:t xml:space="preserve">Wald confidence interval (WII).</w:t>
-      </w:r>
-      <w:r>
-        <w:rPr>
-          <w:rFonts w:ascii="Arial" w:cs="Arial" w:eastAsia="Arial" w:hAnsi="Arial"/>
-          <w:sz w:val="22"/>
-          <w:szCs w:val="22"/>
-        </w:rPr>
-        <w:t xml:space="preserve"> The Weighted Impact Index is a mean of continuous per-respondent scores (ranging roughly from −1 to +1.5). Its 95% CI is computed via the standard error of the mean (SEM):</w:t>
-      </w:r>
-    </w:p>
-    <w:p>
-      <w:pPr>
-        <w:spacing w:after="200" w:before="200"/>
-        <w:jc w:val="center"/>
-      </w:pPr>
-      <w:r>
-        <w:rPr>
-          <w:rFonts w:ascii="Courier New" w:cs="Courier New" w:eastAsia="Courier New" w:hAnsi="Courier New"/>
-          <w:b/>
-          <w:bCs/>
-          <w:color w:val="1F3A5F"/>
-          <w:sz w:val="24"/>
-          <w:szCs w:val="24"/>
-        </w:rPr>
-        <w:t xml:space="preserve">CI = WII ± 1.96 × (SD / √N)</w:t>
-      </w:r>
-    </w:p>
-    <w:p>
-      <w:pPr>
-        <w:spacing w:after="160"/>
-      </w:pPr>
-      <w:r>
-        <w:rPr>
-          <w:rFonts w:ascii="Arial" w:cs="Arial" w:eastAsia="Arial" w:hAnsi="Arial"/>
-          <w:sz w:val="22"/>
-          <w:szCs w:val="22"/>
-        </w:rPr>
-        <w:t xml:space="preserve">where SD is the standard deviation of the per-respondent scores and N is the impact denominator size. The constant 1.96 is the z-score from the standard normal distribution corresponding to 95% confidence (2.5% in each tail). This is justified by the Central Limit Theorem: with tens of thousands of respondents per month, the sampling distribution of the mean is approximately normal regardless of the underlying score distribution.</w:t>
+        <w:t xml:space="preserve">Wilson score interval (share metrics).</w:t>
+      </w:r>
+      <w:r>
+        <w:rPr>
+          <w:rFonts w:ascii="Arial" w:cs="Arial" w:eastAsia="Arial" w:hAnsi="Arial"/>
+          <w:sz w:val="22"/>
+          <w:szCs w:val="22"/>
+        </w:rPr>
+        <w:t xml:space="preserve"> Share-based metrics — adoption rate, individual impact flag shares, positive/negative impact shares — are proportions bounded between 0 and 1. For these, we use the Wilson score 95% confidence interval, which performs better than the Wald interval when proportions are near 0 or 1 or when sample sizes are smaller. This is the same method used in the v1 dashboard.</w:t>
       </w:r>
     </w:p>
     <w:p>
@@ -2447,204 +2576,143 @@
           <w:sz w:val="22"/>
           <w:szCs w:val="22"/>
         </w:rPr>
-        <w:t xml:space="preserve">Example:</w:t>
-      </w:r>
-      <w:r>
-        <w:rPr>
-          <w:rFonts w:ascii="Arial" w:cs="Arial" w:eastAsia="Arial" w:hAnsi="Arial"/>
-          <w:sz w:val="22"/>
-          <w:szCs w:val="22"/>
-        </w:rPr>
-        <w:t xml:space="preserve"> For March 2026 with WII = +0.147 and ~25,000 respondents:</w:t>
-      </w:r>
-    </w:p>
-    <w:p>
-      <w:pPr>
-        <w:spacing w:after="120" w:before="120"/>
+        <w:t xml:space="preserve">Why two methods?</w:t>
+      </w:r>
+      <w:r>
+        <w:rPr>
+          <w:rFonts w:ascii="Arial" w:cs="Arial" w:eastAsia="Arial" w:hAnsi="Arial"/>
+          <w:sz w:val="22"/>
+          <w:szCs w:val="22"/>
+        </w:rPr>
+        <w:t xml:space="preserve"> The WII is a continuous mean, not a proportion, so the Wald/SEM approach is appropriate. The share metrics are bounded proportions where Wilson score intervals provide better coverage, especially at the extremes. Both use the 95% confidence level (z = 1.96).</w:t>
+      </w:r>
+    </w:p>
+    <w:p>
+      <w:pPr>
+        <w:pStyle w:val="Heading2"/>
+      </w:pPr>
+      <w:r>
+        <w:t xml:space="preserve">4.5 Asymmetry by Design</w:t>
+      </w:r>
+    </w:p>
+    <w:p>
+      <w:pPr>
+        <w:spacing w:after="160"/>
+      </w:pPr>
+      <w:r>
+        <w:rPr>
+          <w:rFonts w:ascii="Arial" w:cs="Arial" w:eastAsia="Arial" w:hAnsi="Arial"/>
+          <w:sz w:val="22"/>
+          <w:szCs w:val="22"/>
+        </w:rPr>
+        <w:t xml:space="preserve">The weight scheme is deliberately asymmetric: the most severe negative outcome (job loss, −1.0) carries the same absolute weight as the strongest positive (new opportunities, +1.0), but the cumulative negative weight across all four negative flags (−2.5) exceeds the cumulative positive weight (+1.5). This reflects the stakeholder judgment that </w:t>
+      </w:r>
+      <w:r>
+        <w:rPr>
+          <w:rFonts w:ascii="Arial" w:cs="Arial" w:eastAsia="Arial" w:hAnsi="Arial"/>
+          <w:b/>
+          <w:bCs/>
+          <w:sz w:val="22"/>
+          <w:szCs w:val="22"/>
+        </w:rPr>
+        <w:t xml:space="preserve">severe harms deserve disproportionate weight</w:t>
+      </w:r>
+      <w:r>
+        <w:rPr>
+          <w:rFonts w:ascii="Arial" w:cs="Arial" w:eastAsia="Arial" w:hAnsi="Arial"/>
+          <w:sz w:val="22"/>
+          <w:szCs w:val="22"/>
+        </w:rPr>
+        <w:t xml:space="preserve"> compared to moderate benefits.</w:t>
+      </w:r>
+    </w:p>
+    <w:p>
+      <w:pPr>
+        <w:pStyle w:val="Heading2"/>
+      </w:pPr>
+      <w:r>
+        <w:t xml:space="preserve">4.6 Comparison with v1 Net Impact Index</w:t>
+      </w:r>
+    </w:p>
+    <w:p>
+      <w:pPr>
+        <w:spacing w:after="160"/>
+      </w:pPr>
+      <w:r>
+        <w:rPr>
+          <w:rFonts w:ascii="Arial" w:cs="Arial" w:eastAsia="Arial" w:hAnsi="Arial"/>
+          <w:sz w:val="22"/>
+          <w:szCs w:val="22"/>
+        </w:rPr>
+        <w:t xml:space="preserve">The v1 NII is a simpler binary measure: NII = positive_share − negative_share. A respondent counts as positive if they selected any positive flag and negative if they selected any negative flag. NII treats all impacts equally; WII differentiates by severity.</w:t>
+      </w:r>
+    </w:p>
+    <w:p>
+      <w:pPr>
+        <w:spacing w:after="160"/>
+      </w:pPr>
+      <w:r>
+        <w:rPr>
+          <w:rFonts w:ascii="Arial" w:cs="Arial" w:eastAsia="Arial" w:hAnsi="Arial"/>
+          <w:sz w:val="22"/>
+          <w:szCs w:val="22"/>
+        </w:rPr>
+        <w:t xml:space="preserve">In practice, global WII values (~0.14–0.18) run lower than NII values (~0.20–0.26) because the negative weights are heavier.</w:t>
+      </w:r>
+    </w:p>
+    <w:p>
+      <w:pPr>
+        <w:pStyle w:val="Heading2"/>
+      </w:pPr>
+      <w:r>
+        <w:t xml:space="preserve">4.7 Rolling-Window Pooling</w:t>
+      </w:r>
+    </w:p>
+    <w:p>
+      <w:pPr>
+        <w:spacing w:after="160"/>
+      </w:pPr>
+      <w:r>
+        <w:rPr>
+          <w:rFonts w:ascii="Arial" w:cs="Arial" w:eastAsia="Arial" w:hAnsi="Arial"/>
+          <w:sz w:val="22"/>
+          <w:szCs w:val="22"/>
+        </w:rPr>
+        <w:t xml:space="preserve">When the dashboard is set to a rolling window (e.g., "Last 3 months"), it computes a weighted average of the pre-computed monthly metrics, using each month’s respondent count as the weight:</w:t>
+      </w:r>
+    </w:p>
+    <w:p>
+      <w:pPr>
+        <w:spacing w:after="100" w:before="200"/>
         <w:jc w:val="center"/>
       </w:pPr>
       <w:r>
         <w:rPr>
-          <w:rFonts w:ascii="Courier New" w:cs="Courier New" w:eastAsia="Courier New" w:hAnsi="Courier New"/>
+          <w:rFonts w:ascii="Cambria Math" w:cs="Cambria Math" w:eastAsia="Cambria Math" w:hAnsi="Cambria Math"/>
           <w:b/>
           <w:bCs/>
           <w:color w:val="6366F1"/>
-          <w:sz w:val="22"/>
-          <w:szCs w:val="22"/>
-        </w:rPr>
-        <w:t xml:space="preserve">CI = 0.147 ± 1.96 × (SD / √25000) = [0.140, 0.153]</w:t>
-      </w:r>
-    </w:p>
-    <w:p>
-      <w:pPr>
-        <w:spacing w:after="160"/>
-      </w:pPr>
-      <w:r>
-        <w:rPr>
-          <w:rFonts w:ascii="Arial" w:cs="Arial" w:eastAsia="Arial" w:hAnsi="Arial"/>
-          <w:sz w:val="22"/>
-          <w:szCs w:val="22"/>
-        </w:rPr>
-        <w:t xml:space="preserve">The interval is tight (±0.007) because N is large. The entire interval is above zero, meaning the positive weighted impact is statistically significant.</w:t>
-      </w:r>
-    </w:p>
-    <w:p>
-      <w:pPr>
-        <w:spacing w:after="160"/>
-      </w:pPr>
-      <w:r>
-        <w:rPr>
-          <w:rFonts w:ascii="Arial" w:cs="Arial" w:eastAsia="Arial" w:hAnsi="Arial"/>
-          <w:b/>
-          <w:bCs/>
-          <w:color w:val="2E5C8A"/>
-          <w:sz w:val="22"/>
-          <w:szCs w:val="22"/>
-        </w:rPr>
-        <w:t xml:space="preserve">Wilson score interval (share metrics).</w:t>
-      </w:r>
-      <w:r>
-        <w:rPr>
-          <w:rFonts w:ascii="Arial" w:cs="Arial" w:eastAsia="Arial" w:hAnsi="Arial"/>
-          <w:sz w:val="22"/>
-          <w:szCs w:val="22"/>
-        </w:rPr>
-        <w:t xml:space="preserve"> Share-based metrics — adoption rate, individual impact flag shares, positive/negative impact shares — are proportions bounded between 0 and 1. For these, we use the Wilson score 95% confidence interval, which performs better than the Wald interval when proportions are near 0 or 1 or when sample sizes are smaller. This is the same method used in the v1 dashboard.</w:t>
-      </w:r>
-    </w:p>
-    <w:p>
-      <w:pPr>
-        <w:spacing w:after="160"/>
-      </w:pPr>
-      <w:r>
-        <w:rPr>
-          <w:rFonts w:ascii="Arial" w:cs="Arial" w:eastAsia="Arial" w:hAnsi="Arial"/>
-          <w:b/>
-          <w:bCs/>
-          <w:color w:val="2E5C8A"/>
-          <w:sz w:val="22"/>
-          <w:szCs w:val="22"/>
-        </w:rPr>
-        <w:t xml:space="preserve">Why two methods?</w:t>
-      </w:r>
-      <w:r>
-        <w:rPr>
-          <w:rFonts w:ascii="Arial" w:cs="Arial" w:eastAsia="Arial" w:hAnsi="Arial"/>
-          <w:sz w:val="22"/>
-          <w:szCs w:val="22"/>
-        </w:rPr>
-        <w:t xml:space="preserve"> The WII is a continuous mean, not a proportion, so the Wald/SEM approach is appropriate. The share metrics are bounded proportions where Wilson score intervals provide better coverage, especially at the extremes. Both use the 95% confidence level (z = 1.96).</w:t>
-      </w:r>
-    </w:p>
-    <w:p>
-      <w:pPr>
-        <w:pStyle w:val="Heading2"/>
-      </w:pPr>
-      <w:r>
-        <w:t xml:space="preserve">4.5 Asymmetry by Design</w:t>
-      </w:r>
-    </w:p>
-    <w:p>
-      <w:pPr>
-        <w:spacing w:after="160"/>
-      </w:pPr>
-      <w:r>
-        <w:rPr>
-          <w:rFonts w:ascii="Arial" w:cs="Arial" w:eastAsia="Arial" w:hAnsi="Arial"/>
-          <w:sz w:val="22"/>
-          <w:szCs w:val="22"/>
-        </w:rPr>
-        <w:t xml:space="preserve">The weight scheme is deliberately asymmetric: the most severe negative outcome (job loss, −1.0) carries the same absolute weight as the strongest positive (new opportunities, +1.0), but the cumulative negative weight across all four negative flags (−2.5) exceeds the cumulative positive weight (+1.5). This reflects the stakeholder judgment that </w:t>
-      </w:r>
-      <w:r>
-        <w:rPr>
-          <w:rFonts w:ascii="Arial" w:cs="Arial" w:eastAsia="Arial" w:hAnsi="Arial"/>
-          <w:b/>
-          <w:bCs/>
-          <w:sz w:val="22"/>
-          <w:szCs w:val="22"/>
-        </w:rPr>
-        <w:t xml:space="preserve">severe harms deserve disproportionate weight</w:t>
-      </w:r>
-      <w:r>
-        <w:rPr>
-          <w:rFonts w:ascii="Arial" w:cs="Arial" w:eastAsia="Arial" w:hAnsi="Arial"/>
-          <w:sz w:val="22"/>
-          <w:szCs w:val="22"/>
-        </w:rPr>
-        <w:t xml:space="preserve"> compared to moderate benefits.</w:t>
-      </w:r>
-    </w:p>
-    <w:p>
-      <w:pPr>
-        <w:pStyle w:val="Heading2"/>
-      </w:pPr>
-      <w:r>
-        <w:t xml:space="preserve">4.6 Comparison with v1 Net Impact Index</w:t>
-      </w:r>
-    </w:p>
-    <w:p>
-      <w:pPr>
-        <w:spacing w:after="160"/>
-      </w:pPr>
-      <w:r>
-        <w:rPr>
-          <w:rFonts w:ascii="Arial" w:cs="Arial" w:eastAsia="Arial" w:hAnsi="Arial"/>
-          <w:sz w:val="22"/>
-          <w:szCs w:val="22"/>
-        </w:rPr>
-        <w:t xml:space="preserve">The v1 NII is a simpler binary measure: NII = positive_share − negative_share. A respondent counts as positive if they selected any positive flag and negative if they selected any negative flag. NII treats all impacts equally; WII differentiates by severity.</w:t>
-      </w:r>
-    </w:p>
-    <w:p>
-      <w:pPr>
-        <w:spacing w:after="160"/>
-      </w:pPr>
-      <w:r>
-        <w:rPr>
-          <w:rFonts w:ascii="Arial" w:cs="Arial" w:eastAsia="Arial" w:hAnsi="Arial"/>
-          <w:sz w:val="22"/>
-          <w:szCs w:val="22"/>
-        </w:rPr>
-        <w:t xml:space="preserve">In practice, global WII values (~0.14–0.18) run lower than NII values (~0.20–0.26) because the negative weights are heavier.</w:t>
-      </w:r>
-    </w:p>
-    <w:p>
-      <w:pPr>
-        <w:pStyle w:val="Heading2"/>
-      </w:pPr>
-      <w:r>
-        <w:t xml:space="preserve">4.7 Rolling-Window Pooling</w:t>
-      </w:r>
-    </w:p>
-    <w:p>
-      <w:pPr>
-        <w:spacing w:after="160"/>
-      </w:pPr>
-      <w:r>
-        <w:rPr>
-          <w:rFonts w:ascii="Arial" w:cs="Arial" w:eastAsia="Arial" w:hAnsi="Arial"/>
-          <w:sz w:val="22"/>
-          <w:szCs w:val="22"/>
-        </w:rPr>
-        <w:t xml:space="preserve">When the dashboard is set to a rolling window (e.g., "Last 3 months"), it computes a weighted average of the pre-computed monthly metrics, using each month’s respondent count as the weight:</w:t>
-      </w:r>
-    </w:p>
-    <w:p>
-      <w:pPr>
-        <w:spacing w:after="200" w:before="200"/>
+          <w:sz w:val="26"/>
+          <w:szCs w:val="26"/>
+        </w:rPr>
+        <w:t xml:space="preserve">WII_pooled  =  ∑ (Nₘ ⋅ WIIₘ) / ∑ Nₘ</w:t>
+      </w:r>
+    </w:p>
+    <w:p>
+      <w:pPr>
+        <w:spacing w:after="200"/>
         <w:jc w:val="center"/>
       </w:pPr>
       <w:r>
         <w:rPr>
-          <w:rFonts w:ascii="Courier New" w:cs="Courier New" w:eastAsia="Courier New" w:hAnsi="Courier New"/>
-          <w:b/>
-          <w:bCs/>
-          <w:color w:val="6366F1"/>
-          <w:sz w:val="22"/>
-          <w:szCs w:val="22"/>
-        </w:rPr>
-        <w:t xml:space="preserve">WII_pooled = Σ (N_m × WII_m) / Σ N_m</w:t>
+          <w:rFonts w:ascii="Cambria Math" w:cs="Cambria Math" w:eastAsia="Cambria Math" w:hAnsi="Cambria Math"/>
+          <w:i/>
+          <w:iCs/>
+          <w:color w:val="666666"/>
+          <w:sz w:val="20"/>
+          <w:szCs w:val="20"/>
+        </w:rPr>
+        <w:t xml:space="preserve">m = 1 … w  (months in window)</w:t>
       </w:r>
     </w:p>
     <w:p>
@@ -3397,12 +3465,12 @@
       </w:pPr>
       <w:r>
         <w:rPr>
-          <w:rFonts w:ascii="Courier New" w:cs="Courier New" w:eastAsia="Courier New" w:hAnsi="Courier New"/>
+          <w:rFonts w:ascii="Cambria Math" w:cs="Cambria Math" w:eastAsia="Cambria Math" w:hAnsi="Cambria Math"/>
           <w:b/>
           <w:bCs/>
           <w:color w:val="6366F1"/>
-          <w:sz w:val="22"/>
-          <w:szCs w:val="22"/>
+          <w:sz w:val="24"/>
+          <w:szCs w:val="24"/>
         </w:rPr>
         <w:t xml:space="preserve">WII_pooled = 9,010 / 60,000 = +0.150</w:t>
       </w:r>
@@ -5700,6 +5768,27 @@
           <w:szCs w:val="22"/>
         </w:rPr>
         <w:t xml:space="preserve">Strata with fewer than 50 respondents are suppressed entirely. This threshold is a pragmatic choice; it prevents the noisiest estimates from appearing but does not guarantee statistical reliability. For strata just above the threshold (e.g., N = 55), confidence intervals are wide and point estimates can shift substantially with small data changes. Users should exercise caution when interpreting metrics from low-N strata, even when displayed.</w:t>
+      </w:r>
+    </w:p>
+    <w:p>
+      <w:pPr>
+        <w:pStyle w:val="Heading2"/>
+      </w:pPr>
+      <w:r>
+        <w:t xml:space="preserve">10.9 Confidence Intervals Assume Simple Random Sampling</w:t>
+      </w:r>
+    </w:p>
+    <w:p>
+      <w:pPr>
+        <w:spacing w:after="160"/>
+      </w:pPr>
+      <w:r>
+        <w:rPr>
+          <w:rFonts w:ascii="Arial" w:cs="Arial" w:eastAsia="Arial" w:hAnsi="Arial"/>
+          <w:sz w:val="22"/>
+          <w:szCs w:val="22"/>
+        </w:rPr>
+        <w:t xml:space="preserve">All confidence intervals — both Wald (for WII and frequency mean) and Wilson score (for share metrics) — assume simple random sampling. The GMP respondent pool is a convenience sample, so these CIs may understate the true uncertainty. They will be revised once survey weights are introduced.</w:t>
       </w:r>
     </w:p>
     <w:p>

</xml_diff>